<commit_message>
Reprend l'avis technique CONGO ENERGY LTD dans sa version validee
Version approuvee par l'auteur : cadrage en deux paragraphes, sept points
a a g dans la section I, capacite existante en II, avis en III.

- les treize constats fournis sont regroupes en sept points : puce et
  encodage (a, b), moyens de production et consommables (c), niveau de
  securite allegue et absence de referentiel (d), serveur, logiciels et
  reseau (e), energie, local et securite physique (f), licences (g)
- chaque point distingue le constat verifiable de l'appreciation, signalee
  par une mention en gras
- perimetre strictement technique, fournisseur interne non nomme

Numerotation 1 a 7 portee par le modele (numId 2), lettres a a g par
numId 7. Controle XSD passe, seul word/document.xml differe de l'archive
d'origine, pPr du bloc en-tete et sectPr inchanges.

Co-Authored-By: Claude Opus 5 <noreply@anthropic.com>
Claude-Session: https://claude.ai/code/session_01SsqyVvjd83apw6At2HdXE1
</commit_message>
<xml_diff>
--- a/lettres/avis_technique_congo_energy.docx
+++ b/lettres/avis_technique_congo_energy.docx
@@ -886,7 +886,7 @@
             <w14:round/>
           </w14:textOutline>
         </w:rPr>
-        <w:t xml:space="preserve">Lettre n° 035/DG/MDJ/2026/C.E. Ltd et ses deux annexes.</w:t>
+        <w:t xml:space="preserve">Lettre n° 035/DG/MDJ/2026/C.E. Ltd d’avril 2026 et ses deux annexes.</w:t>
       </w:r>
     </w:p>
     <w:p>
@@ -1028,7 +1028,45 @@
             <w14:round/>
           </w14:textOutline>
         </w:rPr>
-        <w:t xml:space="preserve">Conformément à votre transmission, j’ai procédé à l’examen technique du dossier cité en référence. Le présent avis se limite au domaine de compétence de la Division Numérique : la valeur technique de la solution proposée et sa cohérence avec la chaîne de production des cartes de service de la RAD.</w:t>
+        <w:t xml:space="preserve">Conformément à votre transmission, j’ai procédé à l’examen technique de l’offre spontanée de la société CONGO ENERGY LTD, composée de la lettre d’offre, d’une fiche de spécifications de la carte et d’une liste des matériels, logiciels, serveur et équipements réseau. Le présent avis se limite au registre technique : la valeur de la solution proposée et sa cohérence avec la chaîne de production des cartes de service de la RAD. Il ne porte aucune appréciation d’un autre ordre. Dans chacun des points qui suivent, l’exposé énonce d’abord ce qui est vérifiable dans les pièces du dossier ou dans la documentation des constructeurs, puis, sous la mention </w:t>
+      </w:r>
+      <w:r>
+        <w:rPr>
+          <w:rFonts w:ascii="Tahoma" w:hAnsi="Tahoma" w:cs="Tahoma"/>
+          <w:b/>
+          <w:bCs/>
+          <w:color w:val="000000" w:themeColor="text1"/>
+          <w:sz w:val="28"/>
+          <w14:shadow w14:blurRad="38100" w14:dist="19050" w14:dir="2700000" w14:sx="100000" w14:sy="100000" w14:kx="0" w14:ky="0" w14:algn="tl">
+            <w14:schemeClr w14:val="dk1">
+              <w14:alpha w14:val="60000"/>
+            </w14:schemeClr>
+          </w14:shadow>
+          <w14:textOutline w14:w="0" w14:cap="flat" w14:cmpd="sng" w14:algn="ctr">
+            <w14:noFill/>
+            <w14:prstDash w14:val="solid"/>
+            <w14:round/>
+          </w14:textOutline>
+        </w:rPr>
+        <w:t xml:space="preserve">Appréciation</w:t>
+      </w:r>
+      <w:r>
+        <w:rPr>
+          <w:rFonts w:ascii="Tahoma" w:hAnsi="Tahoma" w:cs="Tahoma"/>
+          <w:color w:val="000000" w:themeColor="text1"/>
+          <w:sz w:val="28"/>
+          <w14:shadow w14:blurRad="38100" w14:dist="19050" w14:dir="2700000" w14:sx="100000" w14:sy="100000" w14:kx="0" w14:ky="0" w14:algn="tl">
+            <w14:schemeClr w14:val="dk1">
+              <w14:alpha w14:val="60000"/>
+            </w14:schemeClr>
+          </w14:shadow>
+          <w14:textOutline w14:w="0" w14:cap="flat" w14:cmpd="sng" w14:algn="ctr">
+            <w14:noFill/>
+            <w14:prstDash w14:val="solid"/>
+            <w14:round/>
+          </w14:textOutline>
+        </w:rPr>
+        <w:t xml:space="preserve">, la conclusion technique que j’en tire.</w:t>
       </w:r>
     </w:p>
     <w:p>
@@ -1091,7 +1129,7 @@
             <w14:round/>
           </w14:textOutline>
         </w:rPr>
-        <w:t xml:space="preserve">Sur le principe, la démarche annoncée n’est pas contestable : l’impression par retransfert avec module de lamination, l’hologramme de surface, la puce sans contact, le serveur de base de données dédié et le pare-feu en tête de réseau correspondent bien à ce qu’exige une production de cartes sécurisées. C’est dans le détail que le dossier ne résiste pas à l’examen.</w:t>
+        <w:t xml:space="preserve">Sur le principe, la démarche annoncée n’est pas contestable : l’impression par retransfert avec module de lamination, un élément optique de surface, une puce sans contact, un serveur de base de données dédié et un pare-feu en tête de réseau correspondent bien à ce qu’exige une production de cartes sécurisées. Mais les neuf fonctions de sécurité annoncées et le bordereau qui les accompagne ne se recoupent pas : les pièces du dossier se contredisent entre elles, plusieurs fonctions annoncées n’ont aucun moyen de production dans la liste livrée, et les organes qui porteraient la base d’identification ne sont pas identifiables avec certitude. C’est dans ce détail, et non dans l’intention, que le dossier ne résiste pas à l’examen.</w:t>
       </w:r>
     </w:p>
     <w:p>
@@ -1220,25 +1258,63 @@
             <w14:round/>
           </w14:textOutline>
         </w:rPr>
-        <w:t xml:space="preserve">Sur le niveau de sécurité annoncé de la carte.</w:t>
-      </w:r>
-      <w:r>
-        <w:rPr>
-          <w:rFonts w:ascii="Tahoma" w:hAnsi="Tahoma" w:cs="Tahoma"/>
-          <w:color w:val="000000" w:themeColor="text1"/>
-          <w:sz w:val="28"/>
-          <w14:shadow w14:blurRad="38100" w14:dist="19050" w14:dir="2700000" w14:sx="100000" w14:sy="100000" w14:kx="0" w14:ky="0" w14:algn="tl">
-            <w14:schemeClr w14:val="dk1">
-              <w14:alpha w14:val="60000"/>
-            </w14:schemeClr>
-          </w14:shadow>
-          <w14:textOutline w14:w="0" w14:cap="flat" w14:cmpd="sng" w14:algn="ctr">
-            <w14:noFill/>
-            <w14:prstDash w14:val="solid"/>
-            <w14:round/>
-          </w14:textOutline>
-        </w:rPr>
-        <w:t xml:space="preserve"> La lettre soutient que la carte offre une protection égale à celle du passeport biométrique et qu’elle « n’est pas falsifiable, quelle que soit la méthode utilisée ». Les spécifications annexées annoncent pourtant une puce MIFARE DESFire, qui est un composant de contrôle d’accès sans contact et non un microcontrôleur de titre régalien conforme à la norme ICAO 9303. L’annexe contredit donc la lettre. Par ailleurs, aucune carte n’est absolument infalsifiable : la sécurité d’un titre s’apprécie en niveaux de résistance et en durée de vie, jamais en invulnérabilité.</w:t>
+        <w:t xml:space="preserve">La chaîne d’encodage de la puce est inopérante en l’état.</w:t>
+      </w:r>
+      <w:r>
+        <w:rPr>
+          <w:rFonts w:ascii="Tahoma" w:hAnsi="Tahoma" w:cs="Tahoma"/>
+          <w:color w:val="000000" w:themeColor="text1"/>
+          <w:sz w:val="28"/>
+          <w14:shadow w14:blurRad="38100" w14:dist="19050" w14:dir="2700000" w14:sx="100000" w14:sy="100000" w14:kx="0" w14:ky="0" w14:algn="tl">
+            <w14:schemeClr w14:val="dk1">
+              <w14:alpha w14:val="60000"/>
+            </w14:schemeClr>
+          </w14:shadow>
+          <w14:textOutline w14:w="0" w14:cap="flat" w14:cmpd="sng" w14:algn="ctr">
+            <w14:noFill/>
+            <w14:prstDash w14:val="solid"/>
+            <w14:round/>
+          </w14:textOutline>
+        </w:rPr>
+        <w:t xml:space="preserve"> Le bordereau retient une licence cardPresso en version XL. Cette version prend en charge l’encodage des puces ISO/IEC 14443-A des familles NTAG, MIFARE Classic et MIFARE Ultralight, mais non MIFARE DESFire, qui relève de la version XXL. Or les spécifications annoncent précisément une puce DESFire et réservent l’encodage à l’informatique de la RAD. Le bordereau ne retient par ailleurs aucune option d’encodage sans contact sur l’imprimante — ces options sont facturées séparément par le constructeur — et ne prévoit aucun lecteur-encodeur externe. </w:t>
+      </w:r>
+      <w:r>
+        <w:rPr>
+          <w:rFonts w:ascii="Tahoma" w:hAnsi="Tahoma" w:cs="Tahoma"/>
+          <w:b/>
+          <w:bCs/>
+          <w:color w:val="000000" w:themeColor="text1"/>
+          <w:sz w:val="28"/>
+          <w14:shadow w14:blurRad="38100" w14:dist="19050" w14:dir="2700000" w14:sx="100000" w14:sy="100000" w14:kx="0" w14:ky="0" w14:algn="tl">
+            <w14:schemeClr w14:val="dk1">
+              <w14:alpha w14:val="60000"/>
+            </w14:schemeClr>
+          </w14:shadow>
+          <w14:textOutline w14:w="0" w14:cap="flat" w14:cmpd="sng" w14:algn="ctr">
+            <w14:noFill/>
+            <w14:prstDash w14:val="solid"/>
+            <w14:round/>
+          </w14:textOutline>
+        </w:rPr>
+        <w:t xml:space="preserve">Appréciation :</w:t>
+      </w:r>
+      <w:r>
+        <w:rPr>
+          <w:rFonts w:ascii="Tahoma" w:hAnsi="Tahoma" w:cs="Tahoma"/>
+          <w:color w:val="000000" w:themeColor="text1"/>
+          <w:sz w:val="28"/>
+          <w14:shadow w14:blurRad="38100" w14:dist="19050" w14:dir="2700000" w14:sx="100000" w14:sy="100000" w14:kx="0" w14:ky="0" w14:algn="tl">
+            <w14:schemeClr w14:val="dk1">
+              <w14:alpha w14:val="60000"/>
+            </w14:schemeClr>
+          </w14:shadow>
+          <w14:textOutline w14:w="0" w14:cap="flat" w14:cmpd="sng" w14:algn="ctr">
+            <w14:noFill/>
+            <w14:prstDash w14:val="solid"/>
+            <w14:round/>
+          </w14:textOutline>
+        </w:rPr>
+        <w:t xml:space="preserve"> la RAD recevrait la charge exclusive d’une opération qu’aucun élément livré ne lui permet d’exécuter. À la réception, la carte annoncée ne pourrait pas être encodée.</w:t>
       </w:r>
     </w:p>
     <w:p>
@@ -1286,25 +1362,63 @@
             <w14:round/>
           </w14:textOutline>
         </w:rPr>
-        <w:t xml:space="preserve">Sur la terminologie des éléments de sécurité.</w:t>
-      </w:r>
-      <w:r>
-        <w:rPr>
-          <w:rFonts w:ascii="Tahoma" w:hAnsi="Tahoma" w:cs="Tahoma"/>
-          <w:color w:val="000000" w:themeColor="text1"/>
-          <w:sz w:val="28"/>
-          <w14:shadow w14:blurRad="38100" w14:dist="19050" w14:dir="2700000" w14:sx="100000" w14:sy="100000" w14:kx="0" w14:ky="0" w14:algn="tl">
-            <w14:schemeClr w14:val="dk1">
-              <w14:alpha w14:val="60000"/>
-            </w14:schemeClr>
-          </w14:shadow>
-          <w14:textOutline w14:w="0" w14:cap="flat" w14:cmpd="sng" w14:algn="ctr">
-            <w14:noFill/>
-            <w14:prstDash w14:val="solid"/>
-            <w14:round/>
-          </w14:textOutline>
-        </w:rPr>
-        <w:t xml:space="preserve"> Plusieurs mentions de la fiche de spécifications sont inexactes ou n’existent pas. Le « verre holographique » n’a pas de sens sur une carte PVC, où l’on parle de vernis ou d’hologramme. La « sécurité Holocote visible par torche UV » confond deux technologies distinctes, les encres réactives aux ultraviolets d’une part et les dispositifs optiquement variables d’autre part. Le « dénouement des données » et la « numérotation des impacts » ne correspondent à aucune fonction de sécurité documentaire identifiable. Enfin, aucune norme n’est citée dans tout le dossier, ni ISO/IEC 7810 pour le format, ni ISO/IEC 14443 pour l’interface sans contact, ni ICAO 9303. Une solution présentée comme étant au standard international mais qui ne nomme aucun standard n’est pas vérifiable.</w:t>
+        <w:t xml:space="preserve">Le composant électronique réellement livré n’est pas déterminé.</w:t>
+      </w:r>
+      <w:r>
+        <w:rPr>
+          <w:rFonts w:ascii="Tahoma" w:hAnsi="Tahoma" w:cs="Tahoma"/>
+          <w:color w:val="000000" w:themeColor="text1"/>
+          <w:sz w:val="28"/>
+          <w14:shadow w14:blurRad="38100" w14:dist="19050" w14:dir="2700000" w14:sx="100000" w14:sy="100000" w14:kx="0" w14:ky="0" w14:algn="tl">
+            <w14:schemeClr w14:val="dk1">
+              <w14:alpha w14:val="60000"/>
+            </w14:schemeClr>
+          </w14:shadow>
+          <w14:textOutline w14:w="0" w14:cap="flat" w14:cmpd="sng" w14:algn="ctr">
+            <w14:noFill/>
+            <w14:prstDash w14:val="solid"/>
+            <w14:round/>
+          </w14:textOutline>
+        </w:rPr>
+        <w:t xml:space="preserve"> Les spécifications annoncent une micro-puce désignée « Milfaré Desfire ». Le bordereau ne mentionne pour sa part que 600 cartes PVC « à technologie MIFARE », sans famille, sans génération et sans capacité mémoire. Cette désignation englobe notamment MIFARE Classic, dont le chiffrement Crypto1 est publiquement compromis et dont les cartes sont clonables. </w:t>
+      </w:r>
+      <w:r>
+        <w:rPr>
+          <w:rFonts w:ascii="Tahoma" w:hAnsi="Tahoma" w:cs="Tahoma"/>
+          <w:b/>
+          <w:bCs/>
+          <w:color w:val="000000" w:themeColor="text1"/>
+          <w:sz w:val="28"/>
+          <w14:shadow w14:blurRad="38100" w14:dist="19050" w14:dir="2700000" w14:sx="100000" w14:sy="100000" w14:kx="0" w14:ky="0" w14:algn="tl">
+            <w14:schemeClr w14:val="dk1">
+              <w14:alpha w14:val="60000"/>
+            </w14:schemeClr>
+          </w14:shadow>
+          <w14:textOutline w14:w="0" w14:cap="flat" w14:cmpd="sng" w14:algn="ctr">
+            <w14:noFill/>
+            <w14:prstDash w14:val="solid"/>
+            <w14:round/>
+          </w14:textOutline>
+        </w:rPr>
+        <w:t xml:space="preserve">Appréciation :</w:t>
+      </w:r>
+      <w:r>
+        <w:rPr>
+          <w:rFonts w:ascii="Tahoma" w:hAnsi="Tahoma" w:cs="Tahoma"/>
+          <w:color w:val="000000" w:themeColor="text1"/>
+          <w:sz w:val="28"/>
+          <w14:shadow w14:blurRad="38100" w14:dist="19050" w14:dir="2700000" w14:sx="100000" w14:sy="100000" w14:kx="0" w14:ky="0" w14:algn="tl">
+            <w14:schemeClr w14:val="dk1">
+              <w14:alpha w14:val="60000"/>
+            </w14:schemeClr>
+          </w14:shadow>
+          <w14:textOutline w14:w="0" w14:cap="flat" w14:cmpd="sng" w14:algn="ctr">
+            <w14:noFill/>
+            <w14:prstDash w14:val="solid"/>
+            <w14:round/>
+          </w14:textOutline>
+        </w:rPr>
+        <w:t xml:space="preserve"> deux pièces du même dossier annoncent deux niveaux de sécurité très éloignés, et rien ne permet de savoir lequel serait effectivement livré. Un titre d’identification ne peut reposer sur un composant que le marché ne définit pas.</w:t>
       </w:r>
     </w:p>
     <w:p>
@@ -1352,25 +1466,63 @@
             <w14:round/>
           </w14:textOutline>
         </w:rPr>
-        <w:t xml:space="preserve">Sur la chaîne d’impression proposée.</w:t>
-      </w:r>
-      <w:r>
-        <w:rPr>
-          <w:rFonts w:ascii="Tahoma" w:hAnsi="Tahoma" w:cs="Tahoma"/>
-          <w:color w:val="000000" w:themeColor="text1"/>
-          <w:sz w:val="28"/>
-          <w14:shadow w14:blurRad="38100" w14:dist="19050" w14:dir="2700000" w14:sx="100000" w14:sy="100000" w14:kx="0" w14:ky="0" w14:algn="tl">
-            <w14:schemeClr w14:val="dk1">
-              <w14:alpha w14:val="60000"/>
-            </w14:schemeClr>
-          </w14:shadow>
-          <w14:textOutline w14:w="0" w14:cap="flat" w14:cmpd="sng" w14:algn="ctr">
-            <w14:noFill/>
-            <w14:prstDash w14:val="solid"/>
-            <w14:round/>
-          </w14:textOutline>
-        </w:rPr>
-        <w:t xml:space="preserve"> Les spécifications renvoient à une imprimante de marque « Smath 81 », tandis que la liste des matériels propose une imprimante Evolis Avansia accompagnée du logiciel Cardpresso. Ce sont deux écosystèmes de constructeurs différents et non interchangeables : la solution réellement proposée n’est donc pas déterminable. Le dimensionnement des consommables est lui aussi incohérent, puisque cinq rubans et cinq films de cinq cents impressions, soit une capacité de deux mille cinq cents cartes, sont prévus pour six cents cartes vierges seulement, sans aucune provision pour rebuts alors que le retransfert en génère systématiquement. Plusieurs désignations sont enfin inexploitables : le « Switch TP-Link SG121 8MP 24 PoE » ne correspond à aucune référence connue et mêle deux densités de ports contradictoires, le routeur est écrit « MiKrotic » au lieu de MikroTik, et la marque de l’imprimante est orthographiée de deux manières différentes dans le même tableau. Un matériel qui ne peut être identifié ne peut être ni commandé, ni réceptionné, ni garanti.</w:t>
+        <w:t xml:space="preserve">Plusieurs éléments de sécurité annoncés n’ont aucun moyen de production, et le dimensionnement des consommables est incohérent.</w:t>
+      </w:r>
+      <w:r>
+        <w:rPr>
+          <w:rFonts w:ascii="Tahoma" w:hAnsi="Tahoma" w:cs="Tahoma"/>
+          <w:color w:val="000000" w:themeColor="text1"/>
+          <w:sz w:val="28"/>
+          <w14:shadow w14:blurRad="38100" w14:dist="19050" w14:dir="2700000" w14:sx="100000" w14:sy="100000" w14:kx="0" w14:ky="0" w14:algn="tl">
+            <w14:schemeClr w14:val="dk1">
+              <w14:alpha w14:val="60000"/>
+            </w14:schemeClr>
+          </w14:shadow>
+          <w14:textOutline w14:w="0" w14:cap="flat" w14:cmpd="sng" w14:algn="ctr">
+            <w14:noFill/>
+            <w14:prstDash w14:val="solid"/>
+            <w14:round/>
+          </w14:textOutline>
+        </w:rPr>
+        <w:t xml:space="preserve"> Le dossier ne désigne d’abord pas une machine unique : les spécifications renvoient à un « fabricant imprimante Smath 81 », vraisemblablement l’IDP SMART-81, tandis que le bordereau propose une Evolis Avansia, soit deux écosystèmes de constructeurs distincts et non interchangeables. Le module de lamination Avansia est ensuite proposé sans laminat : seuls figurent des rubans couleur et des films de retransfert, alors que les vernis, patchs et hologrammes de lamination constituent une gamme de consommables distincte, absente du bordereau. L’élément fluorescent sous ultraviolet suppose un ruban à panneau fluorescent de type YMCFK, quand seul du ruban couleur YMCK est commandé, et aucune torche UV n’est livrée alors que les spécifications en mettent la charge sur la RAD. L’encre thermochromique exige une pré-impression du corps de carte, or seules des cartes PVC nues sont prévues. Le gaufrage exige une embosseuse, absente du bordereau, et endommagerait l’antenne d’une carte sans contact. La fonction « Holocote » — HoloKote — est enfin une fonction propriétaire du constructeur Magicard, réellement fluorescente sous ultraviolet sur ses modèles à retransfert, mais non reproductible sur l’Evolis Avansia du bordereau ni sur la machine visée par les spécifications. Quant aux quantités, cinq rubans et cinq films de 500 impressions offrent une capacité de 2 500 cartes pour 600 cartes vierges seulement, et ni les 600 cartes ni les 600 timbres holographiques ne comportent de marge de rebut, alors que le retransfert en génère systématiquement. </w:t>
+      </w:r>
+      <w:r>
+        <w:rPr>
+          <w:rFonts w:ascii="Tahoma" w:hAnsi="Tahoma" w:cs="Tahoma"/>
+          <w:b/>
+          <w:bCs/>
+          <w:color w:val="000000" w:themeColor="text1"/>
+          <w:sz w:val="28"/>
+          <w14:shadow w14:blurRad="38100" w14:dist="19050" w14:dir="2700000" w14:sx="100000" w14:sy="100000" w14:kx="0" w14:ky="0" w14:algn="tl">
+            <w14:schemeClr w14:val="dk1">
+              <w14:alpha w14:val="60000"/>
+            </w14:schemeClr>
+          </w14:shadow>
+          <w14:textOutline w14:w="0" w14:cap="flat" w14:cmpd="sng" w14:algn="ctr">
+            <w14:noFill/>
+            <w14:prstDash w14:val="solid"/>
+            <w14:round/>
+          </w14:textOutline>
+        </w:rPr>
+        <w:t xml:space="preserve">Appréciation :</w:t>
+      </w:r>
+      <w:r>
+        <w:rPr>
+          <w:rFonts w:ascii="Tahoma" w:hAnsi="Tahoma" w:cs="Tahoma"/>
+          <w:color w:val="000000" w:themeColor="text1"/>
+          <w:sz w:val="28"/>
+          <w14:shadow w14:blurRad="38100" w14:dist="19050" w14:dir="2700000" w14:sx="100000" w14:sy="100000" w14:kx="0" w14:ky="0" w14:algn="tl">
+            <w14:schemeClr w14:val="dk1">
+              <w14:alpha w14:val="60000"/>
+            </w14:schemeClr>
+          </w14:shadow>
+          <w14:textOutline w14:w="0" w14:cap="flat" w14:cmpd="sng" w14:algn="ctr">
+            <w14:noFill/>
+            <w14:prstDash w14:val="solid"/>
+            <w14:round/>
+          </w14:textOutline>
+        </w:rPr>
+        <w:t xml:space="preserve"> cinq des neuf fonctions annoncées ne pourraient pas être produites avec ce qui est livré, le module de lamination serait inexploitable dès la réception, et les consommables sont surdimensionnés là où les supports manquent.</w:t>
       </w:r>
     </w:p>
     <w:p>
@@ -1418,25 +1570,63 @@
             <w14:round/>
           </w14:textOutline>
         </w:rPr>
-        <w:t xml:space="preserve">Sur le serveur et les logiciels.</w:t>
-      </w:r>
-      <w:r>
-        <w:rPr>
-          <w:rFonts w:ascii="Tahoma" w:hAnsi="Tahoma" w:cs="Tahoma"/>
-          <w:color w:val="000000" w:themeColor="text1"/>
-          <w:sz w:val="28"/>
-          <w14:shadow w14:blurRad="38100" w14:dist="19050" w14:dir="2700000" w14:sx="100000" w14:sy="100000" w14:kx="0" w14:ky="0" w14:algn="tl">
-            <w14:schemeClr w14:val="dk1">
-              <w14:alpha w14:val="60000"/>
-            </w14:schemeClr>
-          </w14:shadow>
-          <w14:textOutline w14:w="0" w14:cap="flat" w14:cmpd="sng" w14:algn="ctr">
-            <w14:noFill/>
-            <w14:prstDash w14:val="solid"/>
-            <w14:round/>
-          </w14:textOutline>
-        </w:rPr>
-        <w:t xml:space="preserve"> Un serveur unique est proposé, sans niveau de RAID précisé, sans alimentation redondante, sans solution de sauvegarde ni copie hors site : la base d’identification reposerait ainsi sur un seul point de défaillance. La désignation « Intel Xeon 28 CPU » est impropre, il s’agit de vingt-huit cœurs et non de vingt-huit processeurs, et la génération de serveur retenue est antérieure aux références actuelles du constructeur. Du côté logiciel, la licence Windows Server est proposée sans aucune licence d’accès client, et aucune licence SQL Server ne figure au bordereau alors que les spécifications l’exigent expressément ; ces omissions apparaîtraient comme des coûts supplémentaires après commande. La ligne « antivirus version serveur » ne porte aucune quantité, dix licences biométriques sont prévues pour deux postes de travail seulement, et la ligne « synchronisation des données » ne désigne aucun produit identifiable.</w:t>
+        <w:t xml:space="preserve">Le niveau de sécurité annoncé n’est pas établi et le dossier ne cite aucun référentiel.</w:t>
+      </w:r>
+      <w:r>
+        <w:rPr>
+          <w:rFonts w:ascii="Tahoma" w:hAnsi="Tahoma" w:cs="Tahoma"/>
+          <w:color w:val="000000" w:themeColor="text1"/>
+          <w:sz w:val="28"/>
+          <w14:shadow w14:blurRad="38100" w14:dist="19050" w14:dir="2700000" w14:sx="100000" w14:sy="100000" w14:kx="0" w14:ky="0" w14:algn="tl">
+            <w14:schemeClr w14:val="dk1">
+              <w14:alpha w14:val="60000"/>
+            </w14:schemeClr>
+          </w14:shadow>
+          <w14:textOutline w14:w="0" w14:cap="flat" w14:cmpd="sng" w14:algn="ctr">
+            <w14:noFill/>
+            <w14:prstDash w14:val="solid"/>
+            <w14:round/>
+          </w14:textOutline>
+        </w:rPr>
+        <w:t xml:space="preserve"> La lettre d’offre soutient que la carte « n’est pas falsifiable, quelle que soit la méthode utilisée » et que sa protection égale celle du passeport biométrique. Sur le premier point, aucune carte n’est absolument infalsifiable : la sécurité d’un titre s’apprécie en niveaux de résistance et en durée de vie, non en invulnérabilité. Sur le second, la comparaison ne tient pas. La puce annoncée est un composant sérieux — le DESFire EV3 est certifié Common Criteria au niveau EAL5+ — mais ce n’est pas une plateforme de titre régalien : elle ne met en œuvre ni structure de données normalisée du type LDS, ni authentification passive par infrastructure à clés publiques, ni protocole d’accès BAC ou PACE, qui sont ce qui fonde la confiance dans un passeport biométrique. La certification d’une puce ne dit rien, au surplus, de la résistance du corps de carte, qui est le premier objet de la fraude documentaire. Enfin, aucune norme n’est citée dans l’ensemble du dossier, ni l’ISO/IEC 7810 pour le format, ni l’ISO/IEC 14443 pour l’interface sans contact, et les mentions « verre holographique », « dénouement des données » et « numérotation des impacts » ne correspondent à aucune fonction de sécurité documentaire identifiable. </w:t>
+      </w:r>
+      <w:r>
+        <w:rPr>
+          <w:rFonts w:ascii="Tahoma" w:hAnsi="Tahoma" w:cs="Tahoma"/>
+          <w:b/>
+          <w:bCs/>
+          <w:color w:val="000000" w:themeColor="text1"/>
+          <w:sz w:val="28"/>
+          <w14:shadow w14:blurRad="38100" w14:dist="19050" w14:dir="2700000" w14:sx="100000" w14:sy="100000" w14:kx="0" w14:ky="0" w14:algn="tl">
+            <w14:schemeClr w14:val="dk1">
+              <w14:alpha w14:val="60000"/>
+            </w14:schemeClr>
+          </w14:shadow>
+          <w14:textOutline w14:w="0" w14:cap="flat" w14:cmpd="sng" w14:algn="ctr">
+            <w14:noFill/>
+            <w14:prstDash w14:val="solid"/>
+            <w14:round/>
+          </w14:textOutline>
+        </w:rPr>
+        <w:t xml:space="preserve">Appréciation :</w:t>
+      </w:r>
+      <w:r>
+        <w:rPr>
+          <w:rFonts w:ascii="Tahoma" w:hAnsi="Tahoma" w:cs="Tahoma"/>
+          <w:color w:val="000000" w:themeColor="text1"/>
+          <w:sz w:val="28"/>
+          <w14:shadow w14:blurRad="38100" w14:dist="19050" w14:dir="2700000" w14:sx="100000" w14:sy="100000" w14:kx="0" w14:ky="0" w14:algn="tl">
+            <w14:schemeClr w14:val="dk1">
+              <w14:alpha w14:val="60000"/>
+            </w14:schemeClr>
+          </w14:shadow>
+          <w14:textOutline w14:w="0" w14:cap="flat" w14:cmpd="sng" w14:algn="ctr">
+            <w14:noFill/>
+            <w14:prstDash w14:val="solid"/>
+            <w14:round/>
+          </w14:textOutline>
+        </w:rPr>
+        <w:t xml:space="preserve"> l’équivalence revendiquée avec le passeport biométrique est infondée, et une solution présentée comme conforme au standard international sans nommer aucun standard n’est pas vérifiable. Je précise qu’une carte de service n’a pas à satisfaire le document 9303 de l’OACI, qui régit les documents de voyage : c’est la comparaison qui est en cause, non le niveau d’exigence.</w:t>
       </w:r>
     </w:p>
     <w:p>
@@ -1484,25 +1674,63 @@
             <w14:round/>
           </w14:textOutline>
         </w:rPr>
-        <w:t xml:space="preserve">Sur l’énergie, le local technique et la sécurité physique.</w:t>
-      </w:r>
-      <w:r>
-        <w:rPr>
-          <w:rFonts w:ascii="Tahoma" w:hAnsi="Tahoma" w:cs="Tahoma"/>
-          <w:color w:val="000000" w:themeColor="text1"/>
-          <w:sz w:val="28"/>
-          <w14:shadow w14:blurRad="38100" w14:dist="19050" w14:dir="2700000" w14:sx="100000" w14:sy="100000" w14:kx="0" w14:ky="0" w14:algn="tl">
-            <w14:schemeClr w14:val="dk1">
-              <w14:alpha w14:val="60000"/>
-            </w14:schemeClr>
-          </w14:shadow>
-          <w14:textOutline w14:w="0" w14:cap="flat" w14:cmpd="sng" w14:algn="ctr">
-            <w14:noFill/>
-            <w14:prstDash w14:val="solid"/>
-            <w14:round/>
-          </w14:textOutline>
-        </w:rPr>
-        <w:t xml:space="preserve"> L’onduleur retenu est un onduleur hybride de type solaire, monophasé, et aucun parc de batteries ne figure au bordereau : sans batteries, un tel équipement n’assure aucune autonomie et ne remplace pas un onduleur rack en ligne à double conversion, seul adapté à la protection d’un serveur et d’une chaîne d’impression. Il est de plus associé à un stabilisateur annoncé en triphasé, ce qui rend l’ensemble électriquement incohérent et inexploitable en l’état. Le rack est prévu sans bandeaux de distribution électrique, sans climatisation du local et sans mise à la terre. Le pare-feu est proposé sans abonnement de sécurité, alors que sans souscription active un tel équipement se réduit à un routeur filtrant, sans mise à jour de signatures. Enfin, la sécurité physique de la zone de production se limite à une armoire métallique et à un terminal de contrôle d’accès de gamme commerciale, là où une production sécurisée exige un local à accès journalisé, un coffre pour les cartes vierges et les consommables sécurisés, et une traçabilité des rebuts.</w:t>
+        <w:t xml:space="preserve">Serveur, logiciels, base de données et équipements réseau.</w:t>
+      </w:r>
+      <w:r>
+        <w:rPr>
+          <w:rFonts w:ascii="Tahoma" w:hAnsi="Tahoma" w:cs="Tahoma"/>
+          <w:color w:val="000000" w:themeColor="text1"/>
+          <w:sz w:val="28"/>
+          <w14:shadow w14:blurRad="38100" w14:dist="19050" w14:dir="2700000" w14:sx="100000" w14:sy="100000" w14:kx="0" w14:ky="0" w14:algn="tl">
+            <w14:schemeClr w14:val="dk1">
+              <w14:alpha w14:val="60000"/>
+            </w14:schemeClr>
+          </w14:shadow>
+          <w14:textOutline w14:w="0" w14:cap="flat" w14:cmpd="sng" w14:algn="ctr">
+            <w14:noFill/>
+            <w14:prstDash w14:val="solid"/>
+            <w14:round/>
+          </w14:textOutline>
+        </w:rPr>
+        <w:t xml:space="preserve"> Le dossier propose un serveur unique HPE ProLiant DL380 Gen10, sans niveau de RAID précisé, sans alimentation redondante, sans solution de sauvegarde ni copie hors site. La désignation « Xeon 28 CPU » vise vingt-huit cœurs et non vingt-huit processeurs. Aucun moteur de base de données ne figure au bordereau : seule une licence Windows Server Standard 2022 est prévue, sans licence d’accès client, alors que les spécifications renvoient à « MS SQL server ou autre base de données » et confient cette base à la RAD. La ligne « antivirus version serveur » ne porte aucune quantité, dix licences biométriques sont prévues pour deux postes de travail, et la ligne « synchronisation des données » ne désigne aucun produit identifiable. La gamme HPE Gen10 a par ailleurs été arrêtée en 2024, la dernière date de commande du DL380 Gen10 ayant été portée au 31 mars 2025, ce modèle étant remplacé par le Gen11 puis le Gen12. Le switch est enfin désigné « SG121 8MP 24 PoE » et le routeur « MiKrotic » L009UiGS : ces matériels sont identifiables sous une orthographe fautive, mais leur désignation n’est pas normalisée, et la mention « 24 PoE » contredit la densité de ports du modèle visé. </w:t>
+      </w:r>
+      <w:r>
+        <w:rPr>
+          <w:rFonts w:ascii="Tahoma" w:hAnsi="Tahoma" w:cs="Tahoma"/>
+          <w:b/>
+          <w:bCs/>
+          <w:color w:val="000000" w:themeColor="text1"/>
+          <w:sz w:val="28"/>
+          <w14:shadow w14:blurRad="38100" w14:dist="19050" w14:dir="2700000" w14:sx="100000" w14:sy="100000" w14:kx="0" w14:ky="0" w14:algn="tl">
+            <w14:schemeClr w14:val="dk1">
+              <w14:alpha w14:val="60000"/>
+            </w14:schemeClr>
+          </w14:shadow>
+          <w14:textOutline w14:w="0" w14:cap="flat" w14:cmpd="sng" w14:algn="ctr">
+            <w14:noFill/>
+            <w14:prstDash w14:val="solid"/>
+            <w14:round/>
+          </w14:textOutline>
+        </w:rPr>
+        <w:t xml:space="preserve">Appréciation :</w:t>
+      </w:r>
+      <w:r>
+        <w:rPr>
+          <w:rFonts w:ascii="Tahoma" w:hAnsi="Tahoma" w:cs="Tahoma"/>
+          <w:color w:val="000000" w:themeColor="text1"/>
+          <w:sz w:val="28"/>
+          <w14:shadow w14:blurRad="38100" w14:dist="19050" w14:dir="2700000" w14:sx="100000" w14:sy="100000" w14:kx="0" w14:ky="0" w14:algn="tl">
+            <w14:schemeClr w14:val="dk1">
+              <w14:alpha w14:val="60000"/>
+            </w14:schemeClr>
+          </w14:shadow>
+          <w14:textOutline w14:w="0" w14:cap="flat" w14:cmpd="sng" w14:algn="ctr">
+            <w14:noFill/>
+            <w14:prstDash w14:val="solid"/>
+            <w14:round/>
+          </w14:textOutline>
+        </w:rPr>
+        <w:t xml:space="preserve"> la base d’identification reposerait sur un point unique de défaillance et sur un matériel sorti du catalogue du constructeur avant la date de l’offre, dont la provenance et la couverture de garantie ne sont pas vérifiables ; le moteur de base de données et les licences d’accès apparaîtraient en coûts supplémentaires après commande ; et un matériel dont la désignation n’est pas normalisée ne peut être ni commandé, ni réceptionné, ni garanti.</w:t>
       </w:r>
     </w:p>
     <w:p>
@@ -1550,25 +1778,167 @@
             <w14:round/>
           </w14:textOutline>
         </w:rPr>
-        <w:t xml:space="preserve">Sur les licences et la charge réellement transférée à la RAD.</w:t>
-      </w:r>
-      <w:r>
-        <w:rPr>
-          <w:rFonts w:ascii="Tahoma" w:hAnsi="Tahoma" w:cs="Tahoma"/>
-          <w:color w:val="000000" w:themeColor="text1"/>
-          <w:sz w:val="28"/>
-          <w14:shadow w14:blurRad="38100" w14:dist="19050" w14:dir="2700000" w14:sx="100000" w14:sy="100000" w14:kx="0" w14:ky="0" w14:algn="tl">
-            <w14:schemeClr w14:val="dk1">
-              <w14:alpha w14:val="60000"/>
-            </w14:schemeClr>
-          </w14:shadow>
-          <w14:textOutline w14:w="0" w14:cap="flat" w14:cmpd="sng" w14:algn="ctr">
-            <w14:noFill/>
-            <w14:prstDash w14:val="solid"/>
-            <w14:round/>
-          </w14:textOutline>
-        </w:rPr>
-        <w:t xml:space="preserve"> Les rubriques « licence des données biométriques » et « licence des données sur la micro puce » sont mentionnées sans éditeur, sans périmètre, sans nombre de postes et sans durée. C’est le point le plus lourd du dossier : si la clé ou le droit d’écriture sur la puce demeure chez le fournisseur, la RAD perd la capacité de produire et de remplacer elle-même ses cartes. Il faut relever à ce sujet que les spécifications mettent déjà à la charge de la RAD l’environnement sécurisé, l’encodage de la puce, la base de données, le câblage et le réseau. La maîtrise de la chaîne repose donc, de l’aveu même du soumissionnaire, sur la Division Numérique, l’apport résiduel se limitant à des matériels, des consommables et des licences non définies. Les prestations de service réseau et d’installation du câblage annoncées après livraison sont du reste étrangères à l’objet de l’offre et recoupent des travaux déjà instruits par la Division.</w:t>
+        <w:t xml:space="preserve">Énergie, local technique et sécurité physique.</w:t>
+      </w:r>
+      <w:r>
+        <w:rPr>
+          <w:rFonts w:ascii="Tahoma" w:hAnsi="Tahoma" w:cs="Tahoma"/>
+          <w:color w:val="000000" w:themeColor="text1"/>
+          <w:sz w:val="28"/>
+          <w14:shadow w14:blurRad="38100" w14:dist="19050" w14:dir="2700000" w14:sx="100000" w14:sy="100000" w14:kx="0" w14:ky="0" w14:algn="tl">
+            <w14:schemeClr w14:val="dk1">
+              <w14:alpha w14:val="60000"/>
+            </w14:schemeClr>
+          </w14:shadow>
+          <w14:textOutline w14:w="0" w14:cap="flat" w14:cmpd="sng" w14:algn="ctr">
+            <w14:noFill/>
+            <w14:prstDash w14:val="solid"/>
+            <w14:round/>
+          </w14:textOutline>
+        </w:rPr>
+        <w:t xml:space="preserve"> L’onduleur retenu est un modèle hybride solaire Deye de 3,6 kW en 48 V monophasé, et aucun parc de batteries ne figure au bordereau ; il est associé à un stabilisateur annoncé en 5 000 VA triphasé. Le rack 42U est prévu sans bandeaux de distribution électrique, et le local sans climatisation ni mise à la terre. Le pare-feu FortiGate 200E est proposé sans abonnement de sécurité, et il est en fin de commercialisation depuis le 13 octobre 2025, son support constructeur courant jusqu’au 13 octobre 2030. La sécurité physique de la zone de production se limite à une armoire métallique de 90 × 180 et à un terminal Hikvision MinMoe assurant la reconnaissance faciale et la lecture de carte sans contact. Sur ce dernier point, et sans invoquer aucune interdiction en droit congolais, il est établi que ce constructeur figure sur la liste couverte de la Federal Communications Commission américaine et relève de la section 889 du National Defense Authorization Act, que le Royaume-Uni a ordonné en 2022 le retrait de ses équipements des sites gouvernementaux sensibles et que le Canada les a exclus de ses marchés fédéraux en 2024. </w:t>
+      </w:r>
+      <w:r>
+        <w:rPr>
+          <w:rFonts w:ascii="Tahoma" w:hAnsi="Tahoma" w:cs="Tahoma"/>
+          <w:b/>
+          <w:bCs/>
+          <w:color w:val="000000" w:themeColor="text1"/>
+          <w:sz w:val="28"/>
+          <w14:shadow w14:blurRad="38100" w14:dist="19050" w14:dir="2700000" w14:sx="100000" w14:sy="100000" w14:kx="0" w14:ky="0" w14:algn="tl">
+            <w14:schemeClr w14:val="dk1">
+              <w14:alpha w14:val="60000"/>
+            </w14:schemeClr>
+          </w14:shadow>
+          <w14:textOutline w14:w="0" w14:cap="flat" w14:cmpd="sng" w14:algn="ctr">
+            <w14:noFill/>
+            <w14:prstDash w14:val="solid"/>
+            <w14:round/>
+          </w14:textOutline>
+        </w:rPr>
+        <w:t xml:space="preserve">Appréciation :</w:t>
+      </w:r>
+      <w:r>
+        <w:rPr>
+          <w:rFonts w:ascii="Tahoma" w:hAnsi="Tahoma" w:cs="Tahoma"/>
+          <w:color w:val="000000" w:themeColor="text1"/>
+          <w:sz w:val="28"/>
+          <w14:shadow w14:blurRad="38100" w14:dist="19050" w14:dir="2700000" w14:sx="100000" w14:sy="100000" w14:kx="0" w14:ky="0" w14:algn="tl">
+            <w14:schemeClr w14:val="dk1">
+              <w14:alpha w14:val="60000"/>
+            </w14:schemeClr>
+          </w14:shadow>
+          <w14:textOutline w14:w="0" w14:cap="flat" w14:cmpd="sng" w14:algn="ctr">
+            <w14:noFill/>
+            <w14:prstDash w14:val="solid"/>
+            <w14:round/>
+          </w14:textOutline>
+        </w:rPr>
+        <w:t xml:space="preserve"> sans batteries, l’onduleur proposé n’assure aucune autonomie, et son association à un stabilisateur triphasé rend l’ensemble électriquement incohérent et inexploitable en l’état ; la protection d’un serveur et d’une chaîne d’impression appelle un onduleur rack en ligne à double conversion. Sans souscription active, le pare-feu se réduit à un routeur filtrant, sans mise à jour de signatures. Confier les gabarits biométriques de personnels des FARDC à un terminal de gamme commerciale issu de ce constructeur contredit l’objet même de l’offre, présentée comme une réponse au risque d’infiltration. Une production sécurisée exige enfin un local à accès journalisé, un coffre pour les cartes vierges et les consommables sécurisés, et une traçabilité des rebuts.</w:t>
+      </w:r>
+    </w:p>
+    <w:p>
+      <w:pPr>
+        <w:pStyle w:val="Paragraphedeliste"/>
+        <w:numPr>
+          <w:ilvl w:val="0"/>
+          <w:numId w:val="7"/>
+        </w:numPr>
+        <w:spacing w:after="160" w:line="259" w:lineRule="auto"/>
+        <w:ind w:left="1080" w:hanging="360"/>
+        <w:rPr>
+          <w:rFonts w:ascii="Tahoma" w:hAnsi="Tahoma" w:cs="Tahoma"/>
+          <w:b/>
+          <w:bCs/>
+          <w:color w:val="000000" w:themeColor="text1"/>
+          <w:sz w:val="28"/>
+          <w14:shadow w14:blurRad="38100" w14:dist="19050" w14:dir="2700000" w14:sx="100000" w14:sy="100000" w14:kx="0" w14:ky="0" w14:algn="tl">
+            <w14:schemeClr w14:val="dk1">
+              <w14:alpha w14:val="60000"/>
+            </w14:schemeClr>
+          </w14:shadow>
+          <w14:textOutline w14:w="0" w14:cap="flat" w14:cmpd="sng" w14:algn="ctr">
+            <w14:noFill/>
+            <w14:prstDash w14:val="solid"/>
+            <w14:round/>
+          </w14:textOutline>
+        </w:rPr>
+      </w:pPr>
+      <w:r>
+        <w:rPr>
+          <w:rFonts w:ascii="Tahoma" w:hAnsi="Tahoma" w:cs="Tahoma"/>
+          <w:b/>
+          <w:bCs/>
+          <w:color w:val="000000" w:themeColor="text1"/>
+          <w:sz w:val="28"/>
+          <w14:shadow w14:blurRad="38100" w14:dist="19050" w14:dir="2700000" w14:sx="100000" w14:sy="100000" w14:kx="0" w14:ky="0" w14:algn="tl">
+            <w14:schemeClr w14:val="dk1">
+              <w14:alpha w14:val="60000"/>
+            </w14:schemeClr>
+          </w14:shadow>
+          <w14:textOutline w14:w="0" w14:cap="flat" w14:cmpd="sng" w14:algn="ctr">
+            <w14:noFill/>
+            <w14:prstDash w14:val="solid"/>
+            <w14:round/>
+          </w14:textOutline>
+        </w:rPr>
+        <w:t xml:space="preserve">Licences et charge réellement transférée à la RAD.</w:t>
+      </w:r>
+      <w:r>
+        <w:rPr>
+          <w:rFonts w:ascii="Tahoma" w:hAnsi="Tahoma" w:cs="Tahoma"/>
+          <w:color w:val="000000" w:themeColor="text1"/>
+          <w:sz w:val="28"/>
+          <w14:shadow w14:blurRad="38100" w14:dist="19050" w14:dir="2700000" w14:sx="100000" w14:sy="100000" w14:kx="0" w14:ky="0" w14:algn="tl">
+            <w14:schemeClr w14:val="dk1">
+              <w14:alpha w14:val="60000"/>
+            </w14:schemeClr>
+          </w14:shadow>
+          <w14:textOutline w14:w="0" w14:cap="flat" w14:cmpd="sng" w14:algn="ctr">
+            <w14:noFill/>
+            <w14:prstDash w14:val="solid"/>
+            <w14:round/>
+          </w14:textOutline>
+        </w:rPr>
+        <w:t xml:space="preserve"> Les rubriques « licence des données biométriques » et « licence des données sur la micro puce » sont mentionnées sans éditeur, sans périmètre, sans nombre de postes et sans durée, et elles sont contradictoires avec des spécifications qui réservent l’encodage à la seule informatique de la RAD. Les mêmes spécifications mettent déjà à la charge de la RAD l’environnement sécurisé, l’encodage de la puce, la base de données, la torche UV, les terminaux portables, le câblage et le réseau. Les prestations de service réseau DATA et d’installation du câblage annoncées après livraison sont, quant à elles, étrangères à l’objet de l’offre et recoupent des travaux déjà instruits par la Division. </w:t>
+      </w:r>
+      <w:r>
+        <w:rPr>
+          <w:rFonts w:ascii="Tahoma" w:hAnsi="Tahoma" w:cs="Tahoma"/>
+          <w:b/>
+          <w:bCs/>
+          <w:color w:val="000000" w:themeColor="text1"/>
+          <w:sz w:val="28"/>
+          <w14:shadow w14:blurRad="38100" w14:dist="19050" w14:dir="2700000" w14:sx="100000" w14:sy="100000" w14:kx="0" w14:ky="0" w14:algn="tl">
+            <w14:schemeClr w14:val="dk1">
+              <w14:alpha w14:val="60000"/>
+            </w14:schemeClr>
+          </w14:shadow>
+          <w14:textOutline w14:w="0" w14:cap="flat" w14:cmpd="sng" w14:algn="ctr">
+            <w14:noFill/>
+            <w14:prstDash w14:val="solid"/>
+            <w14:round/>
+          </w14:textOutline>
+        </w:rPr>
+        <w:t xml:space="preserve">Appréciation :</w:t>
+      </w:r>
+      <w:r>
+        <w:rPr>
+          <w:rFonts w:ascii="Tahoma" w:hAnsi="Tahoma" w:cs="Tahoma"/>
+          <w:color w:val="000000" w:themeColor="text1"/>
+          <w:sz w:val="28"/>
+          <w14:shadow w14:blurRad="38100" w14:dist="19050" w14:dir="2700000" w14:sx="100000" w14:sy="100000" w14:kx="0" w14:ky="0" w14:algn="tl">
+            <w14:schemeClr w14:val="dk1">
+              <w14:alpha w14:val="60000"/>
+            </w14:schemeClr>
+          </w14:shadow>
+          <w14:textOutline w14:w="0" w14:cap="flat" w14:cmpd="sng" w14:algn="ctr">
+            <w14:noFill/>
+            <w14:prstDash w14:val="solid"/>
+            <w14:round/>
+          </w14:textOutline>
+        </w:rPr>
+        <w:t xml:space="preserve"> si la clé ou le droit d’écriture sur la puce demeure chez le fournisseur, la RAD perd la capacité de produire et de remplacer elle-même ses cartes. La maîtrise de la chaîne repose donc, de l’aveu même du soumissionnaire, sur la Division Numérique, l’apport résiduel se limitant à des matériels, des consommables et des licences non définies.</w:t>
       </w:r>
     </w:p>
     <w:p>
@@ -1755,7 +2125,7 @@
             <w14:round/>
           </w14:textOutline>
         </w:rPr>
-        <w:t xml:space="preserve">La facture pro forma relative à la station de production a par ailleurs déjà été introduite, et les équipements de même nature que ceux figurant dans la liste annexée à cette offre ont déjà été commandés auprès de notre fournisseur. L’offre examinée fait donc doublon avec une capacité déjà engagée, dont elle reprend l’essentiel du périmètre matériel en y ajoutant des licences non définies et des prestations étrangères à son objet.</w:t>
+        <w:t xml:space="preserve">La facture pro forma relative à la station de production a par ailleurs déjà été introduite, et des équipements de même nature que ceux figurant dans la liste annexée à cette offre ont déjà été commandés auprès de notre fournisseur. L’offre examinée fait donc doublon avec une capacité déjà engagée, dont elle reprend l’essentiel du périmètre matériel en y ajoutant des licences non définies et des prestations étrangères à son objet.</w:t>
       </w:r>
     </w:p>
     <w:p>
@@ -1818,7 +2188,7 @@
             <w14:round/>
           </w14:textOutline>
         </w:rPr>
-        <w:t xml:space="preserve">La Division est en mesure de produire ces cartes en interne, dans les conditions de sécurité requises, pour autant que les moyens adéquats lui soient accordés : achèvement de la commande en cours, complément de consommables, sécurisation du local de production et de la chaîne d’énergie, licences complètes et formation continue des agents concernés.</w:t>
+        <w:t xml:space="preserve">La Division est en mesure de produire ces cartes en interne, dans les conditions de sécurité requises, pour autant que les moyens adéquats lui soient accordés : achèvement de la commande en cours, complément de consommables — notamment les laminats, les rubans à panneau fluorescent et une marge de rebut —, sécurisation du local de production et de la chaîne d’énergie, licences complètes d’encodage et de gestion de la base, et formation continue des agents concernés.</w:t>
       </w:r>
     </w:p>
     <w:p>
@@ -1942,7 +2312,7 @@
             <w14:round/>
           </w14:textOutline>
         </w:rPr>
-        <w:t xml:space="preserve">Sur le plan technique, j’émets un avis défavorable à la suite à donner à cette offre. Le dossier n’est pas cohérent avec lui-même, les matériels ne sont pas tous identifiables, le niveau de sécurité annoncé est contredit par les composants proposés, l’architecture serveur, énergie et local n’est pas exploitable en l’état, et les licences déterminantes ne sont pas définies.</w:t>
+        <w:t xml:space="preserve">Sur le plan technique, j’émets un avis défavorable à la suite à donner à cette offre. Les pièces du dossier se contredisent entre elles, la chaîne d’encodage de la puce annoncée est inopérante en l’état, cinq des neuf fonctions de sécurité annoncées n’ont aucun moyen de production, le composant électronique réellement livré n’est pas déterminé, le niveau de sécurité allégué n’est pas établi, l’architecture serveur, énergie et local n’est pas exploitable, et les licences déterminantes ne sont pas définies.</w:t>
       </w:r>
     </w:p>
     <w:p>
@@ -2005,7 +2375,7 @@
             <w14:round/>
           </w14:textOutline>
         </w:rPr>
-        <w:t xml:space="preserve">Je propose en conséquence de classer ce dossier sans suite sur le plan technique et de concentrer l’effort sur la solution interne déjà engagée, en dotant la Division Numérique des moyens nécessaires à son achèvement. Je reste disponible pour élaborer, sur cette base, le cahier des charges technique de référence de la RAD en matière de cartes de service.</w:t>
+        <w:t xml:space="preserve">Je propose en conséquence de classer ce dossier sans suite sur le plan technique et de concentrer l’effort sur la solution interne déjà engagée, en dotant la Division Numérique des moyens nécessaires à son achèvement. Je reste disponible pour élaborer, sur cette base, le cahier des charges technique de référence de la RAD en matière de cartes de service, qui permettra d’apprécier toute offre future sur des critères nommés et vérifiables.</w:t>
       </w:r>
     </w:p>
     <w:p>

</xml_diff>